<commit_message>
feat: Create Restrospective Cycle 3 document and answer questions
</commit_message>
<xml_diff>
--- a/docs/RetrospectivaC2.docx
+++ b/docs/RetrospectivaC2.docx
@@ -84,7 +84,7 @@
           <w:sz w:val="28"/>
           <w:szCs w:val="28"/>
         </w:rPr>
-        <w:t xml:space="preserve"> CICLO 1</w:t>
+        <w:t xml:space="preserve"> CICLO </w:t>
       </w:r>
       <w:r>
         <w:rPr>
@@ -94,9 +94,8 @@
           <w:sz w:val="28"/>
           <w:szCs w:val="28"/>
         </w:rPr>
-        <w:t xml:space="preserve"> </w:t>
-      </w:r>
-      <w:proofErr w:type="spellStart"/>
+        <w:t>2</w:t>
+      </w:r>
       <w:r>
         <w:rPr>
           <w:rFonts w:ascii="Arial" w:hAnsi="Arial" w:cs="Arial"/>
@@ -105,9 +104,8 @@
           <w:sz w:val="28"/>
           <w:szCs w:val="28"/>
         </w:rPr>
-        <w:t>SlotMachine</w:t>
-      </w:r>
-      <w:proofErr w:type="spellEnd"/>
+        <w:t xml:space="preserve"> SlotMachine</w:t>
+      </w:r>
     </w:p>
     <w:p>
       <w:pPr>
@@ -124,21 +122,7 @@
         <w:rPr>
           <w:rFonts w:ascii="Arial" w:hAnsi="Arial" w:cs="Arial"/>
         </w:rPr>
-        <w:t xml:space="preserve">¿Cuáles fueron los </w:t>
-      </w:r>
-      <w:proofErr w:type="spellStart"/>
-      <w:r>
-        <w:rPr>
-          <w:rFonts w:ascii="Arial" w:hAnsi="Arial" w:cs="Arial"/>
-        </w:rPr>
-        <w:t>mini-ciclos</w:t>
-      </w:r>
-      <w:proofErr w:type="spellEnd"/>
-      <w:r>
-        <w:rPr>
-          <w:rFonts w:ascii="Arial" w:hAnsi="Arial" w:cs="Arial"/>
-        </w:rPr>
-        <w:t xml:space="preserve"> definidos? Justifíquenlos. </w:t>
+        <w:t xml:space="preserve">¿Cuáles fueron los mini-ciclos definidos? Justifíquenlos. </w:t>
       </w:r>
     </w:p>
     <w:p>
@@ -251,39 +235,7 @@
           <w:rFonts w:ascii="Arial" w:hAnsi="Arial" w:cs="Arial"/>
           <w:color w:val="0070C0"/>
         </w:rPr>
-        <w:t xml:space="preserve">Antes de poder intercambiar dos ruedas o hacerlas girar con las nuevas funcionalidades de este ciclo, se requiere de un mecanismo que permita restringir dicha interacción sobre ruedas específicas. Este </w:t>
-      </w:r>
-      <w:proofErr w:type="spellStart"/>
-      <w:r>
-        <w:rPr>
-          <w:rFonts w:ascii="Arial" w:hAnsi="Arial" w:cs="Arial"/>
-          <w:color w:val="0070C0"/>
-        </w:rPr>
-        <w:t>mini-ciclo</w:t>
-      </w:r>
-      <w:proofErr w:type="spellEnd"/>
-      <w:r>
-        <w:rPr>
-          <w:rFonts w:ascii="Arial" w:hAnsi="Arial" w:cs="Arial"/>
-          <w:color w:val="0070C0"/>
-        </w:rPr>
-        <w:t xml:space="preserve"> depende de las ruedas ya creadas en el Ciclo 1, y es independiente de intercambiar o girar, ya que solo se encarga de marcar y desmarcar el estado de bloqueo; los demás </w:t>
-      </w:r>
-      <w:proofErr w:type="spellStart"/>
-      <w:r>
-        <w:rPr>
-          <w:rFonts w:ascii="Arial" w:hAnsi="Arial" w:cs="Arial"/>
-          <w:color w:val="0070C0"/>
-        </w:rPr>
-        <w:t>mini-ciclos</w:t>
-      </w:r>
-      <w:proofErr w:type="spellEnd"/>
-      <w:r>
-        <w:rPr>
-          <w:rFonts w:ascii="Arial" w:hAnsi="Arial" w:cs="Arial"/>
-          <w:color w:val="0070C0"/>
-        </w:rPr>
-        <w:t xml:space="preserve"> de este ciclo dependen de este para validar si una operación puede ejecutarse.</w:t>
+        <w:t>Antes de poder intercambiar dos ruedas o hacerlas girar con las nuevas funcionalidades de este ciclo, se requiere de un mecanismo que permita restringir dicha interacción sobre ruedas específicas. Este mini-ciclo depende de las ruedas ya creadas en el Ciclo 1, y es independiente de intercambiar o girar, ya que solo se encarga de marcar y desmarcar el estado de bloqueo; los demás mini-ciclos de este ciclo dependen de este para validar si una operación puede ejecutarse.</w:t>
       </w:r>
     </w:p>
     <w:p>
@@ -506,29 +458,7 @@
           <w:color w:val="0070C0"/>
           <w:lang w:val="en-US"/>
         </w:rPr>
-        <w:t xml:space="preserve">string[] </w:t>
-      </w:r>
-      <w:proofErr w:type="spellStart"/>
-      <w:r>
-        <w:rPr>
-          <w:rFonts w:ascii="Arial" w:hAnsi="Arial" w:cs="Arial"/>
-          <w:b/>
-          <w:bCs/>
-          <w:color w:val="0070C0"/>
-          <w:lang w:val="en-US"/>
-        </w:rPr>
-        <w:t>setSymbols</w:t>
-      </w:r>
-      <w:proofErr w:type="spellEnd"/>
-      <w:r>
-        <w:rPr>
-          <w:rFonts w:ascii="Arial" w:hAnsi="Arial" w:cs="Arial"/>
-          <w:b/>
-          <w:bCs/>
-          <w:color w:val="0070C0"/>
-          <w:lang w:val="en-US"/>
-        </w:rPr>
-        <w:t>)</w:t>
+        <w:t>string[] setSymbols)</w:t>
       </w:r>
     </w:p>
     <w:p>
@@ -553,87 +483,7 @@
           <w:rFonts w:ascii="Arial" w:hAnsi="Arial" w:cs="Arial"/>
           <w:color w:val="0070C0"/>
         </w:rPr>
-        <w:t>Amplía la funcionalidad básica de giro definida en el Ciclo 1, dando más control sobre el resultado de una tirada: spin(</w:t>
-      </w:r>
-      <w:proofErr w:type="spellStart"/>
-      <w:r>
-        <w:rPr>
-          <w:rFonts w:ascii="Arial" w:hAnsi="Arial" w:cs="Arial"/>
-          <w:color w:val="0070C0"/>
-        </w:rPr>
-        <w:t>int</w:t>
-      </w:r>
-      <w:proofErr w:type="spellEnd"/>
-      <w:r>
-        <w:rPr>
-          <w:rFonts w:ascii="Arial" w:hAnsi="Arial" w:cs="Arial"/>
-          <w:color w:val="0070C0"/>
-        </w:rPr>
-        <w:t xml:space="preserve"> </w:t>
-      </w:r>
-      <w:proofErr w:type="spellStart"/>
-      <w:r>
-        <w:rPr>
-          <w:rFonts w:ascii="Arial" w:hAnsi="Arial" w:cs="Arial"/>
-          <w:color w:val="0070C0"/>
-        </w:rPr>
-        <w:t>wheel</w:t>
-      </w:r>
-      <w:proofErr w:type="spellEnd"/>
-      <w:r>
-        <w:rPr>
-          <w:rFonts w:ascii="Arial" w:hAnsi="Arial" w:cs="Arial"/>
-          <w:color w:val="0070C0"/>
-        </w:rPr>
-        <w:t xml:space="preserve">, </w:t>
-      </w:r>
-      <w:proofErr w:type="spellStart"/>
-      <w:r>
-        <w:rPr>
-          <w:rFonts w:ascii="Arial" w:hAnsi="Arial" w:cs="Arial"/>
-          <w:color w:val="0070C0"/>
-        </w:rPr>
-        <w:t>int</w:t>
-      </w:r>
-      <w:proofErr w:type="spellEnd"/>
-      <w:r>
-        <w:rPr>
-          <w:rFonts w:ascii="Arial" w:hAnsi="Arial" w:cs="Arial"/>
-          <w:color w:val="0070C0"/>
-        </w:rPr>
-        <w:t xml:space="preserve"> </w:t>
-      </w:r>
-      <w:proofErr w:type="spellStart"/>
-      <w:r>
-        <w:rPr>
-          <w:rFonts w:ascii="Arial" w:hAnsi="Arial" w:cs="Arial"/>
-          <w:color w:val="0070C0"/>
-        </w:rPr>
-        <w:t>steps</w:t>
-      </w:r>
-      <w:proofErr w:type="spellEnd"/>
-      <w:r>
-        <w:rPr>
-          <w:rFonts w:ascii="Arial" w:hAnsi="Arial" w:cs="Arial"/>
-          <w:color w:val="0070C0"/>
-        </w:rPr>
-        <w:t xml:space="preserve">) permite avanzar una rueda específica una cantidad determinada de posiciones, y spin(String[] </w:t>
-      </w:r>
-      <w:proofErr w:type="spellStart"/>
-      <w:r>
-        <w:rPr>
-          <w:rFonts w:ascii="Arial" w:hAnsi="Arial" w:cs="Arial"/>
-          <w:color w:val="0070C0"/>
-        </w:rPr>
-        <w:t>setSymbols</w:t>
-      </w:r>
-      <w:proofErr w:type="spellEnd"/>
-      <w:r>
-        <w:rPr>
-          <w:rFonts w:ascii="Arial" w:hAnsi="Arial" w:cs="Arial"/>
-          <w:color w:val="0070C0"/>
-        </w:rPr>
-        <w:t>) permite fijar de una sola vez la configuración completa del tablero. Depende del MIN</w:t>
+        <w:t>Amplía la funcionalidad básica de giro definida en el Ciclo 1, dando más control sobre el resultado de una tirada: spin(int wheel, int steps) permite avanzar una rueda específica una cantidad determinada de posiciones, y spin(String[] setSymbols) permite fijar de una sola vez la configuración completa del tablero. Depende del MIN</w:t>
       </w:r>
       <w:r>
         <w:rPr>
@@ -647,55 +497,7 @@
           <w:rFonts w:ascii="Arial" w:hAnsi="Arial" w:cs="Arial"/>
           <w:color w:val="0070C0"/>
         </w:rPr>
-        <w:t xml:space="preserve">-CICLO 1 para validar el bloqueo antes de operar, y del Ciclo 1 para el giro básico y la verificación de </w:t>
-      </w:r>
-      <w:proofErr w:type="spellStart"/>
-      <w:r>
-        <w:rPr>
-          <w:rFonts w:ascii="Arial" w:hAnsi="Arial" w:cs="Arial"/>
-          <w:color w:val="0070C0"/>
-        </w:rPr>
-        <w:t>jackpot</w:t>
-      </w:r>
-      <w:proofErr w:type="spellEnd"/>
-      <w:r>
-        <w:rPr>
-          <w:rFonts w:ascii="Arial" w:hAnsi="Arial" w:cs="Arial"/>
-          <w:color w:val="0070C0"/>
-        </w:rPr>
-        <w:t xml:space="preserve">, ya que al finalizar ambos métodos comprueban si el resultado constituye un </w:t>
-      </w:r>
-      <w:proofErr w:type="spellStart"/>
-      <w:r>
-        <w:rPr>
-          <w:rFonts w:ascii="Arial" w:hAnsi="Arial" w:cs="Arial"/>
-          <w:color w:val="0070C0"/>
-        </w:rPr>
-        <w:t>jackpot</w:t>
-      </w:r>
-      <w:proofErr w:type="spellEnd"/>
-      <w:r>
-        <w:rPr>
-          <w:rFonts w:ascii="Arial" w:hAnsi="Arial" w:cs="Arial"/>
-          <w:color w:val="0070C0"/>
-        </w:rPr>
-        <w:t xml:space="preserve"> mediante </w:t>
-      </w:r>
-      <w:proofErr w:type="spellStart"/>
-      <w:r>
-        <w:rPr>
-          <w:rFonts w:ascii="Arial" w:hAnsi="Arial" w:cs="Arial"/>
-          <w:color w:val="0070C0"/>
-        </w:rPr>
-        <w:t>winnerAppearance</w:t>
-      </w:r>
-      <w:proofErr w:type="spellEnd"/>
-      <w:r>
-        <w:rPr>
-          <w:rFonts w:ascii="Arial" w:hAnsi="Arial" w:cs="Arial"/>
-          <w:color w:val="0070C0"/>
-        </w:rPr>
-        <w:t>().</w:t>
+        <w:t>-CICLO 1 para validar el bloqueo antes de operar, y del Ciclo 1 para el giro básico y la verificación de jackpot, ya que al finalizar ambos métodos comprueban si el resultado constituye un jackpot mediante winnerAppearance().</w:t>
       </w:r>
     </w:p>
     <w:p>
@@ -750,21 +552,7 @@
           <w:rFonts w:ascii="Arial" w:hAnsi="Arial" w:cs="Arial"/>
         </w:rPr>
         <w:lastRenderedPageBreak/>
-        <w:t xml:space="preserve">¿Cuál es el estado actual del proyecto en términos de </w:t>
-      </w:r>
-      <w:proofErr w:type="spellStart"/>
-      <w:r>
-        <w:rPr>
-          <w:rFonts w:ascii="Arial" w:hAnsi="Arial" w:cs="Arial"/>
-        </w:rPr>
-        <w:t>mini-ciclos</w:t>
-      </w:r>
-      <w:proofErr w:type="spellEnd"/>
-      <w:r>
-        <w:rPr>
-          <w:rFonts w:ascii="Arial" w:hAnsi="Arial" w:cs="Arial"/>
-        </w:rPr>
-        <w:t>? ¿por qué?</w:t>
+        <w:t>¿Cuál es el estado actual del proyecto en términos de mini-ciclos? ¿por qué?</w:t>
       </w:r>
     </w:p>
     <w:p>
@@ -796,39 +584,7 @@
           <w:rFonts w:ascii="Arial" w:hAnsi="Arial" w:cs="Arial"/>
           <w:color w:val="0070C0"/>
         </w:rPr>
-        <w:t xml:space="preserve">El proyecto esta totalmente terminado incluyendo los </w:t>
-      </w:r>
-      <w:proofErr w:type="spellStart"/>
-      <w:r>
-        <w:rPr>
-          <w:rFonts w:ascii="Arial" w:hAnsi="Arial" w:cs="Arial"/>
-          <w:color w:val="0070C0"/>
-        </w:rPr>
-        <w:t>tests</w:t>
-      </w:r>
-      <w:proofErr w:type="spellEnd"/>
-      <w:r>
-        <w:rPr>
-          <w:rFonts w:ascii="Arial" w:hAnsi="Arial" w:cs="Arial"/>
-          <w:color w:val="0070C0"/>
-        </w:rPr>
-        <w:t xml:space="preserve"> de todo el grupo dentro de la wiki, este proyecto tiene sus dos ciclos completamente implementados y listos para presentar, esto porque tuvimos un compromiso revisión y trabajo colaborativo lo mejor que se </w:t>
-      </w:r>
-      <w:proofErr w:type="spellStart"/>
-      <w:r>
-        <w:rPr>
-          <w:rFonts w:ascii="Arial" w:hAnsi="Arial" w:cs="Arial"/>
-          <w:color w:val="0070C0"/>
-        </w:rPr>
-        <w:t>logro</w:t>
-      </w:r>
-      <w:proofErr w:type="spellEnd"/>
-      <w:r>
-        <w:rPr>
-          <w:rFonts w:ascii="Arial" w:hAnsi="Arial" w:cs="Arial"/>
-          <w:color w:val="0070C0"/>
-        </w:rPr>
-        <w:t>.</w:t>
+        <w:t>El proyecto esta totalmente terminado incluyendo los tests de todo el grupo dentro de la wiki, este proyecto tiene sus dos ciclos completamente implementados y listos para presentar, esto porque tuvimos un compromiso revisión y trabajo colaborativo lo mejor que se logro.</w:t>
       </w:r>
     </w:p>
     <w:p>
@@ -1063,7 +819,6 @@
         </w:rPr>
         <w:t>, particularmente en el manejo del comportamiento visual de la interfaz. Inicialmente, nuestro diseño asumía que la máquina de ranuras (</w:t>
       </w:r>
-      <w:proofErr w:type="spellStart"/>
       <w:r>
         <w:rPr>
           <w:rFonts w:ascii="Arial" w:hAnsi="Arial" w:cs="Arial"/>
@@ -1073,29 +828,12 @@
         </w:rPr>
         <w:t>SlotMachine</w:t>
       </w:r>
-      <w:proofErr w:type="spellEnd"/>
-      <w:r>
-        <w:rPr>
-          <w:rFonts w:ascii="Arial" w:hAnsi="Arial" w:cs="Arial"/>
-          <w:color w:val="0070C0"/>
-        </w:rPr>
-        <w:t xml:space="preserve">) se visibilizaba automáticamente por defecto al crearse. Sin embargo, para hacer compatibles los </w:t>
-      </w:r>
-      <w:proofErr w:type="spellStart"/>
-      <w:r>
-        <w:rPr>
-          <w:rFonts w:ascii="Arial" w:hAnsi="Arial" w:cs="Arial"/>
-          <w:color w:val="0070C0"/>
-        </w:rPr>
-        <w:t>tests</w:t>
-      </w:r>
-      <w:proofErr w:type="spellEnd"/>
-      <w:r>
-        <w:rPr>
-          <w:rFonts w:ascii="Arial" w:hAnsi="Arial" w:cs="Arial"/>
-          <w:color w:val="0070C0"/>
-        </w:rPr>
-        <w:t xml:space="preserve"> invisibles, tuvimos que reestructurar la lógica introduciendo un atributo explícito Visible. Modificamos el constructor para que no hiciera la interfaz visible por defecto y agregamos validaciones internas que comprueban si la máquina es visible antes de ejecutar cualquier animación o renderizado gráfico.</w:t>
+      <w:r>
+        <w:rPr>
+          <w:rFonts w:ascii="Arial" w:hAnsi="Arial" w:cs="Arial"/>
+          <w:color w:val="0070C0"/>
+        </w:rPr>
+        <w:t>) se visibilizaba automáticamente por defecto al crearse. Sin embargo, para hacer compatibles los tests invisibles, tuvimos que reestructurar la lógica introduciendo un atributo explícito Visible. Modificamos el constructor para que no hiciera la interfaz visible por defecto y agregamos validaciones internas que comprueban si la máquina es visible antes de ejecutar cualquier animación o renderizado gráfico.</w:t>
       </w:r>
     </w:p>
     <w:p>
@@ -1269,27 +1007,7 @@
           <w:bCs/>
           <w:color w:val="0070C0"/>
         </w:rPr>
-        <w:t xml:space="preserve">Pair </w:t>
-      </w:r>
-      <w:proofErr w:type="spellStart"/>
-      <w:r>
-        <w:rPr>
-          <w:rFonts w:ascii="Arial" w:hAnsi="Arial" w:cs="Arial"/>
-          <w:b/>
-          <w:bCs/>
-          <w:color w:val="0070C0"/>
-        </w:rPr>
-        <w:t>Programming</w:t>
-      </w:r>
-      <w:proofErr w:type="spellEnd"/>
-      <w:r>
-        <w:rPr>
-          <w:rFonts w:ascii="Arial" w:hAnsi="Arial" w:cs="Arial"/>
-          <w:b/>
-          <w:bCs/>
-          <w:color w:val="0070C0"/>
-        </w:rPr>
-        <w:t xml:space="preserve"> (Programación en Pareja)</w:t>
+        <w:t>Pair Programming (Programación en Pareja)</w:t>
       </w:r>
       <w:r>
         <w:rPr>
@@ -1361,6 +1079,7 @@
           <w:b/>
           <w:bCs/>
           <w:color w:val="0070C0"/>
+          <w:lang w:val="en-US"/>
         </w:rPr>
         <w:t>Oracle.</w:t>
       </w:r>
@@ -1372,7 +1091,6 @@
         </w:rPr>
         <w:t xml:space="preserve"> (2023). </w:t>
       </w:r>
-      <w:proofErr w:type="spellStart"/>
       <w:r>
         <w:rPr>
           <w:rFonts w:ascii="Arial" w:hAnsi="Arial" w:cs="Arial"/>
@@ -1381,18 +1099,7 @@
           <w:color w:val="0070C0"/>
           <w:lang w:val="en-US"/>
         </w:rPr>
-        <w:t>Thread.sleep</w:t>
-      </w:r>
-      <w:proofErr w:type="spellEnd"/>
-      <w:r>
-        <w:rPr>
-          <w:rFonts w:ascii="Arial" w:hAnsi="Arial" w:cs="Arial"/>
-          <w:i/>
-          <w:iCs/>
-          <w:color w:val="0070C0"/>
-          <w:lang w:val="en-US"/>
-        </w:rPr>
-        <w:t>() - Class Thread Reference Documentation</w:t>
+        <w:t>Thread.sleep() - Class Thread Reference Documentation</w:t>
       </w:r>
       <w:r>
         <w:rPr>
@@ -1488,21 +1195,12 @@
         </w:rPr>
         <w:t xml:space="preserve"> [Modelo Large Language]. </w:t>
       </w:r>
-      <w:proofErr w:type="spellStart"/>
-      <w:r>
-        <w:rPr>
-          <w:rFonts w:ascii="Arial" w:hAnsi="Arial" w:cs="Arial"/>
-          <w:color w:val="0070C0"/>
-        </w:rPr>
-        <w:t>Anthropic</w:t>
-      </w:r>
-      <w:proofErr w:type="spellEnd"/>
-      <w:r>
-        <w:rPr>
-          <w:rFonts w:ascii="Arial" w:hAnsi="Arial" w:cs="Arial"/>
-          <w:color w:val="0070C0"/>
-        </w:rPr>
-        <w:t xml:space="preserve">. </w:t>
+      <w:r>
+        <w:rPr>
+          <w:rFonts w:ascii="Arial" w:hAnsi="Arial" w:cs="Arial"/>
+          <w:color w:val="0070C0"/>
+        </w:rPr>
+        <w:t xml:space="preserve">Anthropic. </w:t>
       </w:r>
       <w:hyperlink r:id="rId6" w:tgtFrame="_blank" w:history="1">
         <w:r>
@@ -1610,27 +1308,7 @@
           <w:bCs/>
           <w:color w:val="0070C0"/>
         </w:rPr>
-        <w:t xml:space="preserve">Prueba de Aceptación 1 — Configuración completa del tablero, redimensionamiento, detección de </w:t>
-      </w:r>
-      <w:proofErr w:type="spellStart"/>
-      <w:r>
-        <w:rPr>
-          <w:rFonts w:ascii="Arial" w:hAnsi="Arial" w:cs="Arial"/>
-          <w:b/>
-          <w:bCs/>
-          <w:color w:val="0070C0"/>
-        </w:rPr>
-        <w:t>jackpot</w:t>
-      </w:r>
-      <w:proofErr w:type="spellEnd"/>
-      <w:r>
-        <w:rPr>
-          <w:rFonts w:ascii="Arial" w:hAnsi="Arial" w:cs="Arial"/>
-          <w:b/>
-          <w:bCs/>
-          <w:color w:val="0070C0"/>
-        </w:rPr>
-        <w:t xml:space="preserve"> y </w:t>
+        <w:t xml:space="preserve">Prueba de Aceptación 1 — Configuración completa del tablero, redimensionamiento, detección de jackpot y </w:t>
       </w:r>
       <w:r>
         <w:rPr>
@@ -1663,27 +1341,7 @@
           <w:bCs/>
           <w:color w:val="0070C0"/>
         </w:rPr>
-        <w:t xml:space="preserve">Crear una nueva </w:t>
-      </w:r>
-      <w:proofErr w:type="spellStart"/>
-      <w:r>
-        <w:rPr>
-          <w:rFonts w:ascii="Arial" w:hAnsi="Arial" w:cs="Arial"/>
-          <w:b/>
-          <w:bCs/>
-          <w:color w:val="0070C0"/>
-        </w:rPr>
-        <w:t>SlotMachine</w:t>
-      </w:r>
-      <w:proofErr w:type="spellEnd"/>
-      <w:r>
-        <w:rPr>
-          <w:rFonts w:ascii="Arial" w:hAnsi="Arial" w:cs="Arial"/>
-          <w:b/>
-          <w:bCs/>
-          <w:color w:val="0070C0"/>
-        </w:rPr>
-        <w:t>.</w:t>
+        <w:t>Crear una nueva SlotMachine.</w:t>
       </w:r>
     </w:p>
     <w:p>
@@ -1731,27 +1389,7 @@
           <w:bCs/>
           <w:color w:val="0070C0"/>
         </w:rPr>
-        <w:t>Agregar tres símbolos: "red", "blue", "</w:t>
-      </w:r>
-      <w:proofErr w:type="spellStart"/>
-      <w:r>
-        <w:rPr>
-          <w:rFonts w:ascii="Arial" w:hAnsi="Arial" w:cs="Arial"/>
-          <w:b/>
-          <w:bCs/>
-          <w:color w:val="0070C0"/>
-        </w:rPr>
-        <w:t>green</w:t>
-      </w:r>
-      <w:proofErr w:type="spellEnd"/>
-      <w:r>
-        <w:rPr>
-          <w:rFonts w:ascii="Arial" w:hAnsi="Arial" w:cs="Arial"/>
-          <w:b/>
-          <w:bCs/>
-          <w:color w:val="0070C0"/>
-        </w:rPr>
-        <w:t>".</w:t>
+        <w:t>Agregar tres símbolos: "red", "blue", "green".</w:t>
       </w:r>
     </w:p>
     <w:p>
@@ -1776,27 +1414,7 @@
           <w:color w:val="0070C0"/>
         </w:rPr>
         <w:lastRenderedPageBreak/>
-        <w:t>Fijar una configuración manual con spin(new String[]{"</w:t>
-      </w:r>
-      <w:proofErr w:type="spellStart"/>
-      <w:r>
-        <w:rPr>
-          <w:rFonts w:ascii="Arial" w:hAnsi="Arial" w:cs="Arial"/>
-          <w:b/>
-          <w:bCs/>
-          <w:color w:val="0070C0"/>
-        </w:rPr>
-        <w:t>red","red","red</w:t>
-      </w:r>
-      <w:proofErr w:type="spellEnd"/>
-      <w:r>
-        <w:rPr>
-          <w:rFonts w:ascii="Arial" w:hAnsi="Arial" w:cs="Arial"/>
-          <w:b/>
-          <w:bCs/>
-          <w:color w:val="0070C0"/>
-        </w:rPr>
-        <w:t>",...}) (15 elementos, todos "red") para que todas las ruedas muestren el mismo símbolo.</w:t>
+        <w:t>Fijar una configuración manual con spin(new String[]{"red","red","red",...}) (15 elementos, todos "red") para que todas las ruedas muestren el mismo símbolo.</w:t>
       </w:r>
     </w:p>
     <w:p>
@@ -1820,27 +1438,7 @@
           <w:bCs/>
           <w:color w:val="0070C0"/>
         </w:rPr>
-        <w:t xml:space="preserve">Verificar que </w:t>
-      </w:r>
-      <w:proofErr w:type="spellStart"/>
-      <w:r>
-        <w:rPr>
-          <w:rFonts w:ascii="Arial" w:hAnsi="Arial" w:cs="Arial"/>
-          <w:b/>
-          <w:bCs/>
-          <w:color w:val="0070C0"/>
-        </w:rPr>
-        <w:t>isJackpot</w:t>
-      </w:r>
-      <w:proofErr w:type="spellEnd"/>
-      <w:r>
-        <w:rPr>
-          <w:rFonts w:ascii="Arial" w:hAnsi="Arial" w:cs="Arial"/>
-          <w:b/>
-          <w:bCs/>
-          <w:color w:val="0070C0"/>
-        </w:rPr>
-        <w:t>() retorne true.</w:t>
+        <w:t>Verificar que isJackpot() retorne true.</w:t>
       </w:r>
     </w:p>
     <w:p>
@@ -1864,27 +1462,7 @@
           <w:bCs/>
           <w:color w:val="0070C0"/>
         </w:rPr>
-        <w:t xml:space="preserve">Eliminar la rueda en la posición 15 con </w:t>
-      </w:r>
-      <w:proofErr w:type="spellStart"/>
-      <w:r>
-        <w:rPr>
-          <w:rFonts w:ascii="Arial" w:hAnsi="Arial" w:cs="Arial"/>
-          <w:b/>
-          <w:bCs/>
-          <w:color w:val="0070C0"/>
-        </w:rPr>
-        <w:t>delWheel</w:t>
-      </w:r>
-      <w:proofErr w:type="spellEnd"/>
-      <w:r>
-        <w:rPr>
-          <w:rFonts w:ascii="Arial" w:hAnsi="Arial" w:cs="Arial"/>
-          <w:b/>
-          <w:bCs/>
-          <w:color w:val="0070C0"/>
-        </w:rPr>
-        <w:t>(15).</w:t>
+        <w:t>Eliminar la rueda en la posición 15 con delWheel(15).</w:t>
       </w:r>
     </w:p>
     <w:p>
@@ -1908,27 +1486,7 @@
           <w:bCs/>
           <w:color w:val="0070C0"/>
         </w:rPr>
-        <w:t xml:space="preserve">Verificar que el tablero se reduzca correctamente a una sola fila, y que </w:t>
-      </w:r>
-      <w:proofErr w:type="spellStart"/>
-      <w:r>
-        <w:rPr>
-          <w:rFonts w:ascii="Arial" w:hAnsi="Arial" w:cs="Arial"/>
-          <w:b/>
-          <w:bCs/>
-          <w:color w:val="0070C0"/>
-        </w:rPr>
-        <w:t>isJackpot</w:t>
-      </w:r>
-      <w:proofErr w:type="spellEnd"/>
-      <w:r>
-        <w:rPr>
-          <w:rFonts w:ascii="Arial" w:hAnsi="Arial" w:cs="Arial"/>
-          <w:b/>
-          <w:bCs/>
-          <w:color w:val="0070C0"/>
-        </w:rPr>
-        <w:t>() siga retornando true para las 14 ruedas restantes.</w:t>
+        <w:t>Verificar que el tablero se reduzca correctamente a una sola fila, y que isJackpot() siga retornando true para las 14 ruedas restantes.</w:t>
       </w:r>
     </w:p>
     <w:p>
@@ -1952,27 +1510,7 @@
           <w:bCs/>
           <w:color w:val="0070C0"/>
         </w:rPr>
-        <w:t xml:space="preserve">Cambiar el símbolo de una rueda con </w:t>
-      </w:r>
-      <w:proofErr w:type="spellStart"/>
-      <w:r>
-        <w:rPr>
-          <w:rFonts w:ascii="Arial" w:hAnsi="Arial" w:cs="Arial"/>
-          <w:b/>
-          <w:bCs/>
-          <w:color w:val="0070C0"/>
-        </w:rPr>
-        <w:t>placeSymbol</w:t>
-      </w:r>
-      <w:proofErr w:type="spellEnd"/>
-      <w:r>
-        <w:rPr>
-          <w:rFonts w:ascii="Arial" w:hAnsi="Arial" w:cs="Arial"/>
-          <w:b/>
-          <w:bCs/>
-          <w:color w:val="0070C0"/>
-        </w:rPr>
-        <w:t>(5, "blue").</w:t>
+        <w:t>Cambiar el símbolo de una rueda con placeSymbol(5, "blue").</w:t>
       </w:r>
     </w:p>
     <w:p>
@@ -1996,47 +1534,7 @@
           <w:bCs/>
           <w:color w:val="0070C0"/>
         </w:rPr>
-        <w:t xml:space="preserve">Verificar que </w:t>
-      </w:r>
-      <w:proofErr w:type="spellStart"/>
-      <w:r>
-        <w:rPr>
-          <w:rFonts w:ascii="Arial" w:hAnsi="Arial" w:cs="Arial"/>
-          <w:b/>
-          <w:bCs/>
-          <w:color w:val="0070C0"/>
-        </w:rPr>
-        <w:t>isJackpot</w:t>
-      </w:r>
-      <w:proofErr w:type="spellEnd"/>
-      <w:r>
-        <w:rPr>
-          <w:rFonts w:ascii="Arial" w:hAnsi="Arial" w:cs="Arial"/>
-          <w:b/>
-          <w:bCs/>
-          <w:color w:val="0070C0"/>
-        </w:rPr>
-        <w:t xml:space="preserve">() ahora retorne false, y que </w:t>
-      </w:r>
-      <w:proofErr w:type="spellStart"/>
-      <w:r>
-        <w:rPr>
-          <w:rFonts w:ascii="Arial" w:hAnsi="Arial" w:cs="Arial"/>
-          <w:b/>
-          <w:bCs/>
-          <w:color w:val="0070C0"/>
-        </w:rPr>
-        <w:t>distinctSymbols</w:t>
-      </w:r>
-      <w:proofErr w:type="spellEnd"/>
-      <w:r>
-        <w:rPr>
-          <w:rFonts w:ascii="Arial" w:hAnsi="Arial" w:cs="Arial"/>
-          <w:b/>
-          <w:bCs/>
-          <w:color w:val="0070C0"/>
-        </w:rPr>
-        <w:t>() retorne 2.</w:t>
+        <w:t>Verificar que isJackpot() ahora retorne false, y que distinctSymbols() retorne 2.</w:t>
       </w:r>
     </w:p>
     <w:p>
@@ -2091,27 +1589,7 @@
           <w:bCs/>
           <w:color w:val="0070C0"/>
         </w:rPr>
-        <w:t xml:space="preserve">Crear una nueva </w:t>
-      </w:r>
-      <w:proofErr w:type="spellStart"/>
-      <w:r>
-        <w:rPr>
-          <w:rFonts w:ascii="Arial" w:hAnsi="Arial" w:cs="Arial"/>
-          <w:b/>
-          <w:bCs/>
-          <w:color w:val="0070C0"/>
-        </w:rPr>
-        <w:t>SlotMachine</w:t>
-      </w:r>
-      <w:proofErr w:type="spellEnd"/>
-      <w:r>
-        <w:rPr>
-          <w:rFonts w:ascii="Arial" w:hAnsi="Arial" w:cs="Arial"/>
-          <w:b/>
-          <w:bCs/>
-          <w:color w:val="0070C0"/>
-        </w:rPr>
-        <w:t>.</w:t>
+        <w:t>Crear una nueva SlotMachine.</w:t>
       </w:r>
     </w:p>
     <w:p>
@@ -2207,27 +1685,7 @@
           <w:bCs/>
           <w:color w:val="0070C0"/>
         </w:rPr>
-        <w:t xml:space="preserve">Bloquear la rueda 2 con </w:t>
-      </w:r>
-      <w:proofErr w:type="spellStart"/>
-      <w:r>
-        <w:rPr>
-          <w:rFonts w:ascii="Arial" w:hAnsi="Arial" w:cs="Arial"/>
-          <w:b/>
-          <w:bCs/>
-          <w:color w:val="0070C0"/>
-        </w:rPr>
-        <w:t>lock</w:t>
-      </w:r>
-      <w:proofErr w:type="spellEnd"/>
-      <w:r>
-        <w:rPr>
-          <w:rFonts w:ascii="Arial" w:hAnsi="Arial" w:cs="Arial"/>
-          <w:b/>
-          <w:bCs/>
-          <w:color w:val="0070C0"/>
-        </w:rPr>
-        <w:t>(2).</w:t>
+        <w:t>Bloquear la rueda 2 con lock(2).</w:t>
       </w:r>
     </w:p>
     <w:p>
@@ -2299,27 +1757,7 @@
           <w:bCs/>
           <w:color w:val="0070C0"/>
         </w:rPr>
-        <w:t xml:space="preserve">Desbloquear la rueda 2 con </w:t>
-      </w:r>
-      <w:proofErr w:type="spellStart"/>
-      <w:r>
-        <w:rPr>
-          <w:rFonts w:ascii="Arial" w:hAnsi="Arial" w:cs="Arial"/>
-          <w:b/>
-          <w:bCs/>
-          <w:color w:val="0070C0"/>
-        </w:rPr>
-        <w:t>unlock</w:t>
-      </w:r>
-      <w:proofErr w:type="spellEnd"/>
-      <w:r>
-        <w:rPr>
-          <w:rFonts w:ascii="Arial" w:hAnsi="Arial" w:cs="Arial"/>
-          <w:b/>
-          <w:bCs/>
-          <w:color w:val="0070C0"/>
-        </w:rPr>
-        <w:t>(2).</w:t>
+        <w:t>Desbloquear la rueda 2 con unlock(2).</w:t>
       </w:r>
     </w:p>
     <w:p>
@@ -3915,6 +3353,7 @@
   <w:style w:type="character" w:default="1" w:styleId="Fuentedeprrafopredeter">
     <w:name w:val="Default Paragraph Font"/>
     <w:uiPriority w:val="1"/>
+    <w:semiHidden/>
     <w:unhideWhenUsed/>
   </w:style>
   <w:style w:type="table" w:default="1" w:styleId="Tablanormal">

</xml_diff>